<commit_message>
CA5 opening, reply and answering briefs docx: docx/reference.xml extracted from reference.docx (fb docx-reference --extract: the recipe, the CA5/CA styles, widow control off); render.sh's two passes, pagemap.awk and footer.xml move into the filters on fb render's needles (the authorities' heading, then every heading with the words after it, the next heading's label included, and every toa: citation in document order; the answering brief's pages counted from the cover), FORMBOOK_FOOTERS and FORMBOOK_FINAL; scripts, helpers and reference.docx deleted, baseline entries removed; every .docx.pdf byte-identical, check.sh typst, latex and docx 0 failed, XENG-001..003 pass (fb-595.68.3)
</commit_message>
<xml_diff>
--- a/courts/fifth-circuit/court-of-appeals/answering-brief/usage/OUTPUT-answering-brief.docx
+++ b/courts/fifth-circuit/court-of-appeals/answering-brief/usage/OUTPUT-answering-brief.docx
@@ -4725,60 +4725,6 @@
 
 <file path=word/comments.xml><?xml version="1.0" encoding="utf-8"?>
 <w:comments xmlns:w="http://schemas.openxmlformats.org/wordprocessingml/2006/main" xmlns:m="http://schemas.openxmlformats.org/officeDocument/2006/math" xmlns:r="http://schemas.openxmlformats.org/officeDocument/2006/relationships" xmlns:o="urn:schemas-microsoft-com:office:office" xmlns:v="urn:schemas-microsoft-com:vml" xmlns:w10="urn:schemas-microsoft-com:office:word" xmlns:a="http://schemas.openxmlformats.org/drawingml/2006/main" xmlns:pic="http://schemas.openxmlformats.org/drawingml/2006/picture" xmlns:wp="http://schemas.openxmlformats.org/drawingml/2006/wordprocessingDrawing"/>
-</file>
-
-<file path=word/footer-arabic.xml><?xml version="1.0" encoding="utf-8"?>
-<w:ftr xmlns:w="http://schemas.openxmlformats.org/wordprocessingml/2006/main" xmlns:r="http://schemas.openxmlformats.org/officeDocument/2006/relationships">
-  <w:p>
-    <w:pPr>
-      <w:spacing w:before="0" w:after="0" w:line="240" w:lineRule="auto"/>
-      <w:ind w:firstLine="0"/>
-      <w:jc w:val="center"/>
-    </w:pPr>
-    <w:r>
-      <w:fldChar w:fldCharType="begin"/>
-    </w:r>
-    <w:r>
-      <w:instrText xml:space="preserve"> PAGE </w:instrText>
-    </w:r>
-    <w:r>
-      <w:fldChar w:fldCharType="separate"/>
-    </w:r>
-    <w:r>
-      <w:t>1</w:t>
-    </w:r>
-    <w:r>
-      <w:fldChar w:fldCharType="end"/>
-    </w:r>
-  </w:p>
-</w:ftr>
-</file>
-
-<file path=word/footer-roman.xml><?xml version="1.0" encoding="utf-8"?>
-<w:ftr xmlns:w="http://schemas.openxmlformats.org/wordprocessingml/2006/main" xmlns:r="http://schemas.openxmlformats.org/officeDocument/2006/relationships">
-  <w:p>
-    <w:pPr>
-      <w:spacing w:before="0" w:after="0" w:line="240" w:lineRule="auto"/>
-      <w:ind w:firstLine="0"/>
-      <w:jc w:val="center"/>
-    </w:pPr>
-    <w:r>
-      <w:fldChar w:fldCharType="begin"/>
-    </w:r>
-    <w:r>
-      <w:instrText xml:space="preserve"> PAGE </w:instrText>
-    </w:r>
-    <w:r>
-      <w:fldChar w:fldCharType="separate"/>
-    </w:r>
-    <w:r>
-      <w:t>1</w:t>
-    </w:r>
-    <w:r>
-      <w:fldChar w:fldCharType="end"/>
-    </w:r>
-  </w:p>
-</w:ftr>
 </file>
 
 <file path=word/footer1.xml><?xml version="1.0" encoding="utf-8"?>
@@ -4920,6 +4866,99 @@
     </w:p>
   </w:footnote>
 </w:footnotes>
+</file>
+
+<file path=word/ftr-add.xml><?xml version="1.0" encoding="utf-8"?>
+<w:ftr xmlns:w="http://schemas.openxmlformats.org/wordprocessingml/2006/main" xmlns:r="http://schemas.openxmlformats.org/officeDocument/2006/relationships">
+  <w:p>
+    <w:pPr>
+      <w:spacing w:before="0" w:after="0"/>
+      <w:jc w:val="center"/>
+    </w:pPr>
+    <w:r>
+      <w:t>Add-</w:t>
+    </w:r>
+    <w:r>
+      <w:fldChar w:fldCharType="begin"/>
+    </w:r>
+    <w:r>
+      <w:instrText xml:space="preserve"> PAGE </w:instrText>
+    </w:r>
+    <w:r>
+      <w:fldChar w:fldCharType="separate"/>
+    </w:r>
+    <w:r>
+      <w:t>1</w:t>
+    </w:r>
+    <w:r>
+      <w:fldChar w:fldCharType="end"/>
+    </w:r>
+  </w:p>
+</w:ftr>
+</file>
+
+<file path=word/ftr-none.xml><?xml version="1.0" encoding="utf-8"?>
+<w:ftr xmlns:w="http://schemas.openxmlformats.org/wordprocessingml/2006/main" xmlns:r="http://schemas.openxmlformats.org/officeDocument/2006/relationships">
+  <w:p>
+    <w:pPr>
+      <w:spacing w:before="0" w:after="0"/>
+      <w:jc w:val="center"/>
+    </w:pPr>
+  </w:p>
+</w:ftr>
+</file>
+
+<file path=word/ftr-own1.xml><?xml version="1.0" encoding="utf-8"?>
+<w:ftr xmlns:w="http://schemas.openxmlformats.org/wordprocessingml/2006/main" xmlns:r="http://schemas.openxmlformats.org/officeDocument/2006/relationships">
+  <w:p>
+    <w:pPr>
+      <w:spacing w:before="0" w:after="0" w:line="240" w:lineRule="auto"/>
+      <w:ind w:firstLine="0"/>
+      <w:jc w:val="center"/>
+    </w:pPr>
+    <w:r>
+      <w:fldChar w:fldCharType="begin"/>
+    </w:r>
+    <w:r>
+      <w:instrText xml:space="preserve"> PAGE </w:instrText>
+    </w:r>
+    <w:r>
+      <w:fldChar w:fldCharType="separate"/>
+    </w:r>
+    <w:r>
+      <w:t>1</w:t>
+    </w:r>
+    <w:r>
+      <w:fldChar w:fldCharType="end"/>
+    </w:r>
+  </w:p>
+</w:ftr>
+</file>
+
+<file path=word/ftr-page.xml><?xml version="1.0" encoding="utf-8"?>
+<w:ftr xmlns:w="http://schemas.openxmlformats.org/wordprocessingml/2006/main" xmlns:r="http://schemas.openxmlformats.org/officeDocument/2006/relationships">
+  <w:p>
+    <w:pPr>
+      <w:spacing w:before="0" w:after="0"/>
+      <w:jc w:val="center"/>
+    </w:pPr>
+    <w:r>
+      <w:fldChar w:fldCharType="begin"/>
+    </w:r>
+    <w:r>
+      <w:instrText xml:space="preserve"> PAGE </w:instrText>
+    </w:r>
+    <w:r>
+      <w:fldChar w:fldCharType="separate"/>
+    </w:r>
+    <w:r>
+      <w:t>1</w:t>
+    </w:r>
+    <w:r>
+      <w:fldChar w:fldCharType="end"/>
+    </w:r>
+  </w:p>
+</w:ftr>
 </file>
 
 <file path=word/numbering.xml><?xml version="1.0" encoding="utf-8"?>

</xml_diff>